<commit_message>
Correção template educar mais
</commit_message>
<xml_diff>
--- a/historicos/template_educar_mais.docx
+++ b/historicos/template_educar_mais.docx
@@ -203,9 +203,8 @@
                 <w:szCs w:val="18"/>
                 <w:lang w:val="pt-BR" w:eastAsia="en-US"/>
               </w:rPr>
-              <w:t>{TEL_</w:t>
-            </w:r>
-            <w:proofErr w:type="gramStart"/>
+              <w:t>{TEL_1}</w:t>
+            </w:r>
             <w:r>
               <w:rPr>
                 <w:rFonts w:ascii="Century Gothic" w:hAnsi="Century Gothic" w:cs="Lucida Sans Unicode"/>
@@ -213,18 +212,8 @@
                 <w:szCs w:val="18"/>
                 <w:lang w:val="pt-BR" w:eastAsia="en-US"/>
               </w:rPr>
-              <w:t>1}</w:t>
-            </w:r>
-            <w:r>
-              <w:rPr>
-                <w:rFonts w:ascii="Century Gothic" w:hAnsi="Century Gothic" w:cs="Lucida Sans Unicode"/>
-                <w:sz w:val="18"/>
-                <w:szCs w:val="18"/>
-                <w:lang w:val="pt-BR" w:eastAsia="en-US"/>
-              </w:rPr>
               <w:t>/</w:t>
             </w:r>
-            <w:proofErr w:type="gramEnd"/>
             <w:r>
               <w:rPr>
                 <w:rFonts w:ascii="Century Gothic" w:hAnsi="Century Gothic" w:cs="Lucida Sans Unicode"/>
@@ -296,7 +285,7 @@
             <v:imagedata r:id="rId8" o:title=""/>
             <w10:wrap anchorx="page" anchory="page"/>
           </v:shape>
-          <o:OLEObject Type="Embed" ProgID="MS_ClipArt_Gallery" ShapeID="_x0000_s1026" DrawAspect="Content" ObjectID="_1836560280" r:id="rId9"/>
+          <o:OLEObject Type="Embed" ProgID="MS_ClipArt_Gallery" ShapeID="_x0000_s1026" DrawAspect="Content" ObjectID="_1837149696" r:id="rId9"/>
         </w:object>
       </w:r>
       <w:r>
@@ -1782,23 +1771,7 @@
                 <w:rFonts w:ascii="Century Gothic" w:hAnsi="Century Gothic" w:cs="Lucida Sans Unicode"/>
                 <w:sz w:val="20"/>
               </w:rPr>
-              <w:t>{#</w:t>
-            </w:r>
-            <w:proofErr w:type="gramStart"/>
-            <w:r>
-              <w:rPr>
-                <w:rFonts w:ascii="Century Gothic" w:hAnsi="Century Gothic" w:cs="Lucida Sans Unicode"/>
-                <w:sz w:val="20"/>
-              </w:rPr>
-              <w:t>disciplinas}{</w:t>
-            </w:r>
-            <w:proofErr w:type="gramEnd"/>
-            <w:r>
-              <w:rPr>
-                <w:rFonts w:ascii="Century Gothic" w:hAnsi="Century Gothic" w:cs="Lucida Sans Unicode"/>
-                <w:sz w:val="20"/>
-              </w:rPr>
-              <w:t>nome}</w:t>
+              <w:t>{#disciplinas}{nome}</w:t>
             </w:r>
           </w:p>
         </w:tc>
@@ -1948,25 +1921,7 @@
                 <w:sz w:val="20"/>
                 <w:lang w:eastAsia="en-US"/>
               </w:rPr>
-              <w:t>{nota_</w:t>
-            </w:r>
-            <w:proofErr w:type="gramStart"/>
-            <w:r>
-              <w:rPr>
-                <w:rFonts w:ascii="Century Gothic" w:hAnsi="Century Gothic" w:cs="Arial"/>
-                <w:sz w:val="20"/>
-                <w:lang w:eastAsia="en-US"/>
-              </w:rPr>
-              <w:t>5}{</w:t>
-            </w:r>
-            <w:proofErr w:type="gramEnd"/>
-            <w:r>
-              <w:rPr>
-                <w:rFonts w:ascii="Century Gothic" w:hAnsi="Century Gothic" w:cs="Arial"/>
-                <w:sz w:val="20"/>
-                <w:lang w:eastAsia="en-US"/>
-              </w:rPr>
-              <w:t>/disciplinas}</w:t>
+              <w:t>{nota_5}{/disciplinas}</w:t>
             </w:r>
           </w:p>
         </w:tc>
@@ -4050,33 +4005,15 @@
                 <w:sz w:val="20"/>
                 <w:lang w:val="pt-BR"/>
               </w:rPr>
-              <w:t>{</w:t>
-            </w:r>
-            <w:proofErr w:type="gramStart"/>
-            <w:r>
-              <w:rPr>
-                <w:rFonts w:ascii="Century Gothic" w:hAnsi="Century Gothic" w:cs="Lucida Sans Unicode"/>
-                <w:sz w:val="20"/>
-                <w:lang w:val="pt-BR"/>
-              </w:rPr>
-              <w:t>CLASSE}</w:t>
-            </w:r>
-            <w:r>
-              <w:rPr>
-                <w:rFonts w:ascii="Century Gothic" w:hAnsi="Century Gothic" w:cs="Lucida Sans Unicode"/>
-                <w:sz w:val="20"/>
-                <w:lang w:val="pt-BR"/>
-              </w:rPr>
-              <w:t xml:space="preserve">   </w:t>
-            </w:r>
-            <w:proofErr w:type="gramEnd"/>
-            <w:r>
-              <w:rPr>
-                <w:rFonts w:ascii="Century Gothic" w:hAnsi="Century Gothic" w:cs="Lucida Sans Unicode"/>
-                <w:sz w:val="20"/>
-                <w:lang w:val="pt-BR"/>
-              </w:rPr>
-              <w:t xml:space="preserve">  </w:t>
+              <w:t>{CLASSE}</w:t>
+            </w:r>
+            <w:r>
+              <w:rPr>
+                <w:rFonts w:ascii="Century Gothic" w:hAnsi="Century Gothic" w:cs="Lucida Sans Unicode"/>
+                <w:sz w:val="20"/>
+                <w:lang w:val="pt-BR"/>
+              </w:rPr>
+              <w:t xml:space="preserve">     </w:t>
             </w:r>
             <w:r>
               <w:rPr>
@@ -4094,33 +4031,15 @@
                 <w:sz w:val="20"/>
                 <w:lang w:val="pt-BR"/>
               </w:rPr>
-              <w:t>{</w:t>
-            </w:r>
-            <w:proofErr w:type="gramStart"/>
-            <w:r>
-              <w:rPr>
-                <w:rFonts w:ascii="Century Gothic" w:hAnsi="Century Gothic" w:cs="Lucida Sans Unicode"/>
-                <w:sz w:val="20"/>
-                <w:lang w:val="pt-BR"/>
-              </w:rPr>
-              <w:t>TURNO}</w:t>
-            </w:r>
-            <w:r>
-              <w:rPr>
-                <w:rFonts w:ascii="Century Gothic" w:hAnsi="Century Gothic" w:cs="Lucida Sans Unicode"/>
-                <w:sz w:val="20"/>
-                <w:lang w:val="pt-BR"/>
-              </w:rPr>
-              <w:t xml:space="preserve">   </w:t>
-            </w:r>
-            <w:proofErr w:type="gramEnd"/>
-            <w:r>
-              <w:rPr>
-                <w:rFonts w:ascii="Century Gothic" w:hAnsi="Century Gothic" w:cs="Lucida Sans Unicode"/>
-                <w:sz w:val="20"/>
-                <w:lang w:val="pt-BR"/>
-              </w:rPr>
-              <w:t xml:space="preserve">   </w:t>
+              <w:t>{TURNO}</w:t>
+            </w:r>
+            <w:r>
+              <w:rPr>
+                <w:rFonts w:ascii="Century Gothic" w:hAnsi="Century Gothic" w:cs="Lucida Sans Unicode"/>
+                <w:sz w:val="20"/>
+                <w:lang w:val="pt-BR"/>
+              </w:rPr>
+              <w:t xml:space="preserve">      </w:t>
             </w:r>
             <w:r>
               <w:rPr>
@@ -4146,33 +4065,15 @@
                 <w:sz w:val="20"/>
                 <w:lang w:val="pt-BR"/>
               </w:rPr>
-              <w:t>{</w:t>
-            </w:r>
-            <w:proofErr w:type="gramStart"/>
-            <w:r>
-              <w:rPr>
-                <w:rFonts w:ascii="Century Gothic" w:hAnsi="Century Gothic" w:cs="Lucida Sans Unicode"/>
-                <w:sz w:val="20"/>
-                <w:lang w:val="pt-BR"/>
-              </w:rPr>
-              <w:t>CICLO}</w:t>
-            </w:r>
-            <w:r>
-              <w:rPr>
-                <w:rFonts w:ascii="Century Gothic" w:hAnsi="Century Gothic" w:cs="Lucida Sans Unicode"/>
-                <w:sz w:val="20"/>
-                <w:lang w:val="pt-BR"/>
-              </w:rPr>
-              <w:t xml:space="preserve">   </w:t>
-            </w:r>
-            <w:proofErr w:type="gramEnd"/>
-            <w:r>
-              <w:rPr>
-                <w:rFonts w:ascii="Century Gothic" w:hAnsi="Century Gothic" w:cs="Lucida Sans Unicode"/>
-                <w:sz w:val="20"/>
-                <w:lang w:val="pt-BR"/>
-              </w:rPr>
-              <w:t xml:space="preserve">   </w:t>
+              <w:t>{CICLO}</w:t>
+            </w:r>
+            <w:r>
+              <w:rPr>
+                <w:rFonts w:ascii="Century Gothic" w:hAnsi="Century Gothic" w:cs="Lucida Sans Unicode"/>
+                <w:sz w:val="20"/>
+                <w:lang w:val="pt-BR"/>
+              </w:rPr>
+              <w:t xml:space="preserve">      </w:t>
             </w:r>
             <w:r>
               <w:rPr>
@@ -4198,33 +4099,15 @@
                 <w:sz w:val="20"/>
                 <w:lang w:val="pt-BR"/>
               </w:rPr>
-              <w:t>{ANO_</w:t>
-            </w:r>
-            <w:proofErr w:type="gramStart"/>
-            <w:r>
-              <w:rPr>
-                <w:rFonts w:ascii="Century Gothic" w:hAnsi="Century Gothic" w:cs="Lucida Sans Unicode"/>
-                <w:sz w:val="20"/>
-                <w:lang w:val="pt-BR"/>
-              </w:rPr>
-              <w:t>TRANSF}</w:t>
-            </w:r>
-            <w:r>
-              <w:rPr>
-                <w:rFonts w:ascii="Century Gothic" w:hAnsi="Century Gothic" w:cs="Lucida Sans Unicode"/>
-                <w:sz w:val="20"/>
-                <w:lang w:val="pt-BR"/>
-              </w:rPr>
-              <w:t xml:space="preserve">   </w:t>
-            </w:r>
-            <w:proofErr w:type="gramEnd"/>
-            <w:r>
-              <w:rPr>
-                <w:rFonts w:ascii="Century Gothic" w:hAnsi="Century Gothic" w:cs="Lucida Sans Unicode"/>
-                <w:sz w:val="20"/>
-                <w:lang w:val="pt-BR"/>
-              </w:rPr>
-              <w:t xml:space="preserve">   </w:t>
+              <w:t>{ANO_TRANSF}</w:t>
+            </w:r>
+            <w:r>
+              <w:rPr>
+                <w:rFonts w:ascii="Century Gothic" w:hAnsi="Century Gothic" w:cs="Lucida Sans Unicode"/>
+                <w:sz w:val="20"/>
+                <w:lang w:val="pt-BR"/>
+              </w:rPr>
+              <w:t xml:space="preserve">      </w:t>
             </w:r>
             <w:r>
               <w:rPr>
@@ -4250,33 +4133,15 @@
                 <w:sz w:val="20"/>
                 <w:lang w:val="pt-BR"/>
               </w:rPr>
-              <w:t>{</w:t>
-            </w:r>
-            <w:proofErr w:type="gramStart"/>
-            <w:r>
-              <w:rPr>
-                <w:rFonts w:ascii="Century Gothic" w:hAnsi="Century Gothic" w:cs="Lucida Sans Unicode"/>
-                <w:sz w:val="20"/>
-                <w:lang w:val="pt-BR"/>
-              </w:rPr>
-              <w:t>TURMA}</w:t>
-            </w:r>
-            <w:r>
-              <w:rPr>
-                <w:rFonts w:ascii="Century Gothic" w:hAnsi="Century Gothic" w:cs="Lucida Sans Unicode"/>
-                <w:sz w:val="20"/>
-                <w:lang w:val="pt-BR"/>
-              </w:rPr>
-              <w:t xml:space="preserve">   </w:t>
-            </w:r>
-            <w:proofErr w:type="gramEnd"/>
-            <w:r>
-              <w:rPr>
-                <w:rFonts w:ascii="Century Gothic" w:hAnsi="Century Gothic" w:cs="Lucida Sans Unicode"/>
-                <w:sz w:val="20"/>
-                <w:lang w:val="pt-BR"/>
-              </w:rPr>
-              <w:t xml:space="preserve">   </w:t>
+              <w:t>{TURMA}</w:t>
+            </w:r>
+            <w:r>
+              <w:rPr>
+                <w:rFonts w:ascii="Century Gothic" w:hAnsi="Century Gothic" w:cs="Lucida Sans Unicode"/>
+                <w:sz w:val="20"/>
+                <w:lang w:val="pt-BR"/>
+              </w:rPr>
+              <w:t xml:space="preserve">      </w:t>
             </w:r>
             <w:r>
               <w:rPr>
@@ -4310,33 +4175,15 @@
                 <w:sz w:val="20"/>
                 <w:lang w:val="pt-BR"/>
               </w:rPr>
-              <w:t>{N_</w:t>
-            </w:r>
-            <w:proofErr w:type="gramStart"/>
-            <w:r>
-              <w:rPr>
-                <w:rFonts w:ascii="Century Gothic" w:hAnsi="Century Gothic" w:cs="Lucida Sans Unicode"/>
-                <w:sz w:val="20"/>
-                <w:lang w:val="pt-BR"/>
-              </w:rPr>
-              <w:t>CHAMADA}</w:t>
-            </w:r>
-            <w:r>
-              <w:rPr>
-                <w:rFonts w:ascii="Century Gothic" w:hAnsi="Century Gothic" w:cs="Lucida Sans Unicode"/>
-                <w:sz w:val="20"/>
-                <w:lang w:val="pt-BR"/>
-              </w:rPr>
-              <w:t xml:space="preserve">   </w:t>
-            </w:r>
-            <w:proofErr w:type="gramEnd"/>
-            <w:r>
-              <w:rPr>
-                <w:rFonts w:ascii="Century Gothic" w:hAnsi="Century Gothic" w:cs="Lucida Sans Unicode"/>
-                <w:sz w:val="20"/>
-                <w:lang w:val="pt-BR"/>
-              </w:rPr>
-              <w:t xml:space="preserve">      </w:t>
+              <w:t>{N_CHAMADA}</w:t>
+            </w:r>
+            <w:r>
+              <w:rPr>
+                <w:rFonts w:ascii="Century Gothic" w:hAnsi="Century Gothic" w:cs="Lucida Sans Unicode"/>
+                <w:sz w:val="20"/>
+                <w:lang w:val="pt-BR"/>
+              </w:rPr>
+              <w:t xml:space="preserve">         </w:t>
             </w:r>
           </w:p>
         </w:tc>
@@ -6607,15 +6454,7 @@
                 <w:rFonts w:ascii="Century Gothic" w:hAnsi="Century Gothic" w:cs="Lucida Sans Unicode"/>
                 <w:b/>
               </w:rPr>
-              <w:t>ANO_</w:t>
-            </w:r>
-            <w:proofErr w:type="gramStart"/>
-            <w:r>
-              <w:rPr>
-                <w:rFonts w:ascii="Century Gothic" w:hAnsi="Century Gothic" w:cs="Lucida Sans Unicode"/>
-                <w:b/>
-              </w:rPr>
-              <w:t>HISTORICO</w:t>
+              <w:t>ANO_HISTORICO</w:t>
             </w:r>
             <w:r>
               <w:rPr>
@@ -6628,14 +6467,7 @@
               <w:rPr>
                 <w:rFonts w:ascii="Century Gothic" w:hAnsi="Century Gothic" w:cs="Lucida Sans Unicode"/>
               </w:rPr>
-              <w:t>º</w:t>
-            </w:r>
-            <w:proofErr w:type="gramEnd"/>
-            <w:r>
-              <w:rPr>
-                <w:rFonts w:ascii="Century Gothic" w:hAnsi="Century Gothic" w:cs="Lucida Sans Unicode"/>
-              </w:rPr>
-              <w:t xml:space="preserve"> ano</w:t>
+              <w:t>º ano</w:t>
             </w:r>
             <w:r>
               <w:rPr>
@@ -6763,30 +6595,14 @@
                 <w:rFonts w:ascii="Century Gothic" w:hAnsi="Century Gothic"/>
                 <w:color w:val="000000"/>
               </w:rPr>
-              <w:t>{</w:t>
-            </w:r>
-            <w:proofErr w:type="gramStart"/>
+              <w:t>{DATA}</w:t>
+            </w:r>
             <w:r>
               <w:rPr>
                 <w:rFonts w:ascii="Century Gothic" w:hAnsi="Century Gothic"/>
                 <w:color w:val="000000"/>
               </w:rPr>
-              <w:t>DATA}</w:t>
-            </w:r>
-            <w:r>
-              <w:rPr>
-                <w:rFonts w:ascii="Century Gothic" w:hAnsi="Century Gothic"/>
-                <w:color w:val="000000"/>
-              </w:rPr>
-              <w:t xml:space="preserve">   </w:t>
-            </w:r>
-            <w:proofErr w:type="gramEnd"/>
-            <w:r>
-              <w:rPr>
-                <w:rFonts w:ascii="Century Gothic" w:hAnsi="Century Gothic"/>
-                <w:color w:val="000000"/>
-              </w:rPr>
-              <w:t xml:space="preserve">                                                    ___________________________________</w:t>
+              <w:t xml:space="preserve">                                                       ___________________________________</w:t>
             </w:r>
           </w:p>
           <w:p>
@@ -6806,7 +6622,7 @@
                 <w:sz w:val="18"/>
                 <w:szCs w:val="18"/>
               </w:rPr>
-              <w:t>Diretor (a) Escolar</w:t>
+              <w:t>{ASSINATURA_RESPONSAVEL}</w:t>
             </w:r>
           </w:p>
         </w:tc>

</xml_diff>